<commit_message>
Veri bilimi projesi final teslimi
</commit_message>
<xml_diff>
--- a/veribilimirapor.docx
+++ b/veribilimirapor.docx
@@ -1622,7 +1622,7 @@
           <w:szCs w:val="28"/>
         </w:rPr>
         <w:drawing>
-          <wp:inline distT="0" distB="0" distL="0" distR="0" wp14:anchorId="3FA3D4BC" wp14:editId="39B15087">
+          <wp:inline distT="0" distB="0" distL="0" distR="0" wp14:anchorId="3FA3D4BC" wp14:editId="6C2CF150">
             <wp:extent cx="5520905" cy="4299141"/>
             <wp:effectExtent l="0" t="0" r="3810" b="6350"/>
             <wp:docPr id="1391027711" name="Resim 3"/>
@@ -1678,24 +1678,14 @@
       <w:r>
         <w:t xml:space="preserve"> </w:t>
       </w:r>
-      <w:r>
-        <w:fldChar w:fldCharType="begin"/>
-      </w:r>
-      <w:r>
-        <w:instrText xml:space="preserve"> SEQ Figure \* ARABIC </w:instrText>
-      </w:r>
-      <w:r>
-        <w:fldChar w:fldCharType="separate"/>
-      </w:r>
-      <w:r>
-        <w:rPr>
-          <w:noProof/>
-        </w:rPr>
-        <w:t>2</w:t>
-      </w:r>
-      <w:r>
-        <w:fldChar w:fldCharType="end"/>
-      </w:r>
+      <w:fldSimple w:instr=" SEQ Figure \* ARABIC ">
+        <w:r>
+          <w:rPr>
+            <w:noProof/>
+          </w:rPr>
+          <w:t>2</w:t>
+        </w:r>
+      </w:fldSimple>
       <w:r>
         <w:t xml:space="preserve"> Temel İstatistik Grafikleri</w:t>
       </w:r>
@@ -1970,12 +1960,6 @@
         </w:rPr>
         <w:t xml:space="preserve"> Korelasyon ve yoğunluk matrisi incelendiğinde, en yüksek renk doygunluğunun (oran bazlı pik noktalarının) her üç dönemde de erkek popülasyonunun üretken ve genç yaş dilimlerinde kümelendiği matematiksel olarak mühürlenmiştir.</w:t>
       </w:r>
-    </w:p>
-    <w:p>
-      <w:pPr>
-        <w:keepNext/>
-        <w:spacing w:before="240" w:after="240"/>
-      </w:pPr>
     </w:p>
     <w:p>
       <w:pPr>
@@ -2085,24 +2069,14 @@
       <w:r>
         <w:t xml:space="preserve"> </w:t>
       </w:r>
-      <w:r>
-        <w:fldChar w:fldCharType="begin"/>
-      </w:r>
-      <w:r>
-        <w:instrText xml:space="preserve"> SEQ Figure \* ARABIC </w:instrText>
-      </w:r>
-      <w:r>
-        <w:fldChar w:fldCharType="separate"/>
-      </w:r>
-      <w:r>
-        <w:rPr>
-          <w:noProof/>
-        </w:rPr>
-        <w:t>1</w:t>
-      </w:r>
-      <w:r>
-        <w:fldChar w:fldCharType="end"/>
-      </w:r>
+      <w:fldSimple w:instr=" SEQ Figure \* ARABIC ">
+        <w:r>
+          <w:rPr>
+            <w:noProof/>
+          </w:rPr>
+          <w:t>1</w:t>
+        </w:r>
+      </w:fldSimple>
       <w:r>
         <w:t xml:space="preserve"> Regresyon Modeli</w:t>
       </w:r>
@@ -2243,6 +2217,19 @@
       <w:proofErr w:type="spellEnd"/>
       <w:r>
         <w:t>) ve veri temizleme süreçlerinde ne kadar efektif bir geliştirme ortağı olabileceği deneyimlenmiştir.</w:t>
+      </w:r>
+    </w:p>
+    <w:p>
+      <w:pPr>
+        <w:spacing w:before="240" w:after="240"/>
+      </w:pPr>
+      <w:proofErr w:type="spellStart"/>
+      <w:r>
+        <w:t>Github</w:t>
+      </w:r>
+      <w:proofErr w:type="spellEnd"/>
+      <w:r>
+        <w:t xml:space="preserve"> Linki: </w:t>
       </w:r>
     </w:p>
     <w:p>
@@ -6556,6 +6543,7 @@
   <w:style w:type="character" w:default="1" w:styleId="VarsaylanParagrafYazTipi">
     <w:name w:val="Default Paragraph Font"/>
     <w:uiPriority w:val="1"/>
+    <w:semiHidden/>
     <w:unhideWhenUsed/>
   </w:style>
   <w:style w:type="table" w:default="1" w:styleId="NormalTablo">

</xml_diff>